<commit_message>
docs: capturas de la app en emulador e incrustadas en el reporte
</commit_message>
<xml_diff>
--- a/docs/REPORTE_TECNICO.docx
+++ b/docs/REPORTE_TECNICO.docx
@@ -4438,22 +4438,320 @@
     </w:p>
     <w:p>
       <w:pPr>
-        <w:pStyle w:val="ListParagraph"/>
-        <w:numPr>
-          <w:ilvl w:val="0"/>
-          <w:numId w:val="2"/>
-        </w:numPr>
-        <w:spacing w:after="80"/>
+        <w:spacing w:after="160"/>
+      </w:pPr>
+      <w:r>
+        <w:t xml:space="preserve">Capturas de la aplicación ejecutándose en el emulador Pixel 8 desde Android Studio. Los archivos originales están en la carpeta docs/capturas/ del repositorio.</w:t>
+      </w:r>
+    </w:p>
+    <w:p>
+      <w:pPr>
+        <w:spacing w:after="60" w:before="200"/>
+        <w:jc w:val="center"/>
+      </w:pPr>
+      <w:r>
+        <w:drawing>
+          <wp:inline distT="0" distB="0" distL="0" distR="0">
+            <wp:extent cx="1800225" cy="4000500"/>
+            <wp:effectExtent t="0" r="0" b="0" l="0"/>
+            <wp:docPr id="1" name="" descr="" title=""/>
+            <wp:cNvGraphicFramePr>
+              <a:graphicFrameLocks xmlns:a="http://schemas.openxmlformats.org/drawingml/2006/main" noChangeAspect="1"/>
+            </wp:cNvGraphicFramePr>
+            <a:graphic xmlns:a="http://schemas.openxmlformats.org/drawingml/2006/main">
+              <a:graphicData uri="http://schemas.openxmlformats.org/drawingml/2006/picture">
+                <pic:pic xmlns:pic="http://schemas.openxmlformats.org/drawingml/2006/picture">
+                  <pic:nvPicPr>
+                    <pic:cNvPr id="0" name="" descr=""/>
+                    <pic:cNvPicPr>
+                      <a:picLocks noChangeAspect="1" noChangeArrowheads="1"/>
+                    </pic:cNvPicPr>
+                  </pic:nvPicPr>
+                  <pic:blipFill>
+                    <a:blip r:embed="rId8" cstate="none"/>
+                    <a:srcRect/>
+                    <a:stretch>
+                      <a:fillRect/>
+                    </a:stretch>
+                  </pic:blipFill>
+                  <pic:spPr bwMode="auto">
+                    <a:xfrm>
+                      <a:off x="0" y="0"/>
+                      <a:ext cx="1800225" cy="4000500"/>
+                    </a:xfrm>
+                    <a:prstGeom prst="rect">
+                      <a:avLst/>
+                    </a:prstGeom>
+                  </pic:spPr>
+                </pic:pic>
+              </a:graphicData>
+            </a:graphic>
+          </wp:inline>
+        </w:drawing>
+      </w:r>
+    </w:p>
+    <w:p>
+      <w:pPr>
+        <w:spacing w:after="200"/>
+        <w:jc w:val="center"/>
       </w:pPr>
       <w:r>
         <w:rPr>
-          <w:b/>
-          <w:bCs/>
+          <w:i/>
+          <w:iCs/>
+          <w:color w:val="555555"/>
+          <w:sz w:val="18"/>
+          <w:szCs w:val="18"/>
         </w:rPr>
-        <w:t xml:space="preserve">Capturas de pantalla</w:t>
-      </w:r>
-      <w:r>
-        <w:t xml:space="preserve">: carpeta docs/capturas/ del repositorio (insertar: lista vacía, búsqueda, pronóstico, modo offline, notificación push).</w:t>
+        <w:t xml:space="preserve">Figura 1. Pantalla principal en el primer arranque (sin ciudades guardadas).</w:t>
+      </w:r>
+    </w:p>
+    <w:p>
+      <w:pPr>
+        <w:spacing w:after="60" w:before="200"/>
+        <w:jc w:val="center"/>
+      </w:pPr>
+      <w:r>
+        <w:drawing>
+          <wp:inline distT="0" distB="0" distL="0" distR="0">
+            <wp:extent cx="5715000" cy="3067050"/>
+            <wp:effectExtent t="0" r="0" b="0" l="0"/>
+            <wp:docPr id="1" name="" descr="" title=""/>
+            <wp:cNvGraphicFramePr>
+              <a:graphicFrameLocks xmlns:a="http://schemas.openxmlformats.org/drawingml/2006/main" noChangeAspect="1"/>
+            </wp:cNvGraphicFramePr>
+            <a:graphic xmlns:a="http://schemas.openxmlformats.org/drawingml/2006/main">
+              <a:graphicData uri="http://schemas.openxmlformats.org/drawingml/2006/picture">
+                <pic:pic xmlns:pic="http://schemas.openxmlformats.org/drawingml/2006/picture">
+                  <pic:nvPicPr>
+                    <pic:cNvPr id="0" name="" descr=""/>
+                    <pic:cNvPicPr>
+                      <a:picLocks noChangeAspect="1" noChangeArrowheads="1"/>
+                    </pic:cNvPicPr>
+                  </pic:nvPicPr>
+                  <pic:blipFill>
+                    <a:blip r:embed="rId9" cstate="none"/>
+                    <a:srcRect/>
+                    <a:stretch>
+                      <a:fillRect/>
+                    </a:stretch>
+                  </pic:blipFill>
+                  <pic:spPr bwMode="auto">
+                    <a:xfrm>
+                      <a:off x="0" y="0"/>
+                      <a:ext cx="5715000" cy="3067050"/>
+                    </a:xfrm>
+                    <a:prstGeom prst="rect">
+                      <a:avLst/>
+                    </a:prstGeom>
+                  </pic:spPr>
+                </pic:pic>
+              </a:graphicData>
+            </a:graphic>
+          </wp:inline>
+        </w:drawing>
+      </w:r>
+    </w:p>
+    <w:p>
+      <w:pPr>
+        <w:spacing w:after="200"/>
+        <w:jc w:val="center"/>
+      </w:pPr>
+      <w:r>
+        <w:rPr>
+          <w:i/>
+          <w:iCs/>
+          <w:color w:val="555555"/>
+          <w:sz w:val="18"/>
+          <w:szCs w:val="18"/>
+        </w:rPr>
+        <w:t xml:space="preserve">Figura 2. Búsqueda de ciudad con el texto “monterrey”.</w:t>
+      </w:r>
+    </w:p>
+    <w:p>
+      <w:pPr>
+        <w:spacing w:after="60" w:before="200"/>
+        <w:jc w:val="center"/>
+      </w:pPr>
+      <w:r>
+        <w:drawing>
+          <wp:inline distT="0" distB="0" distL="0" distR="0">
+            <wp:extent cx="5715000" cy="3038475"/>
+            <wp:effectExtent t="0" r="0" b="0" l="0"/>
+            <wp:docPr id="1" name="" descr="" title=""/>
+            <wp:cNvGraphicFramePr>
+              <a:graphicFrameLocks xmlns:a="http://schemas.openxmlformats.org/drawingml/2006/main" noChangeAspect="1"/>
+            </wp:cNvGraphicFramePr>
+            <a:graphic xmlns:a="http://schemas.openxmlformats.org/drawingml/2006/main">
+              <a:graphicData uri="http://schemas.openxmlformats.org/drawingml/2006/picture">
+                <pic:pic xmlns:pic="http://schemas.openxmlformats.org/drawingml/2006/picture">
+                  <pic:nvPicPr>
+                    <pic:cNvPr id="0" name="" descr=""/>
+                    <pic:cNvPicPr>
+                      <a:picLocks noChangeAspect="1" noChangeArrowheads="1"/>
+                    </pic:cNvPicPr>
+                  </pic:nvPicPr>
+                  <pic:blipFill>
+                    <a:blip r:embed="rId10" cstate="none"/>
+                    <a:srcRect/>
+                    <a:stretch>
+                      <a:fillRect/>
+                    </a:stretch>
+                  </pic:blipFill>
+                  <pic:spPr bwMode="auto">
+                    <a:xfrm>
+                      <a:off x="0" y="0"/>
+                      <a:ext cx="5715000" cy="3038475"/>
+                    </a:xfrm>
+                    <a:prstGeom prst="rect">
+                      <a:avLst/>
+                    </a:prstGeom>
+                  </pic:spPr>
+                </pic:pic>
+              </a:graphicData>
+            </a:graphic>
+          </wp:inline>
+        </w:drawing>
+      </w:r>
+    </w:p>
+    <w:p>
+      <w:pPr>
+        <w:spacing w:after="200"/>
+        <w:jc w:val="center"/>
+      </w:pPr>
+      <w:r>
+        <w:rPr>
+          <w:i/>
+          <w:iCs/>
+          <w:color w:val="555555"/>
+          <w:sz w:val="18"/>
+          <w:szCs w:val="18"/>
+        </w:rPr>
+        <w:t xml:space="preserve">Figura 3. Resultados de la búsqueda (API de geocodificación de Open-Meteo).</w:t>
+      </w:r>
+    </w:p>
+    <w:p>
+      <w:pPr>
+        <w:spacing w:after="60" w:before="200"/>
+        <w:jc w:val="center"/>
+      </w:pPr>
+      <w:r>
+        <w:drawing>
+          <wp:inline distT="0" distB="0" distL="0" distR="0">
+            <wp:extent cx="5715000" cy="3028950"/>
+            <wp:effectExtent t="0" r="0" b="0" l="0"/>
+            <wp:docPr id="1" name="" descr="" title=""/>
+            <wp:cNvGraphicFramePr>
+              <a:graphicFrameLocks xmlns:a="http://schemas.openxmlformats.org/drawingml/2006/main" noChangeAspect="1"/>
+            </wp:cNvGraphicFramePr>
+            <a:graphic xmlns:a="http://schemas.openxmlformats.org/drawingml/2006/main">
+              <a:graphicData uri="http://schemas.openxmlformats.org/drawingml/2006/picture">
+                <pic:pic xmlns:pic="http://schemas.openxmlformats.org/drawingml/2006/picture">
+                  <pic:nvPicPr>
+                    <pic:cNvPr id="0" name="" descr=""/>
+                    <pic:cNvPicPr>
+                      <a:picLocks noChangeAspect="1" noChangeArrowheads="1"/>
+                    </pic:cNvPicPr>
+                  </pic:nvPicPr>
+                  <pic:blipFill>
+                    <a:blip r:embed="rId11" cstate="none"/>
+                    <a:srcRect/>
+                    <a:stretch>
+                      <a:fillRect/>
+                    </a:stretch>
+                  </pic:blipFill>
+                  <pic:spPr bwMode="auto">
+                    <a:xfrm>
+                      <a:off x="0" y="0"/>
+                      <a:ext cx="5715000" cy="3028950"/>
+                    </a:xfrm>
+                    <a:prstGeom prst="rect">
+                      <a:avLst/>
+                    </a:prstGeom>
+                  </pic:spPr>
+                </pic:pic>
+              </a:graphicData>
+            </a:graphic>
+          </wp:inline>
+        </w:drawing>
+      </w:r>
+    </w:p>
+    <w:p>
+      <w:pPr>
+        <w:spacing w:after="200"/>
+        <w:jc w:val="center"/>
+      </w:pPr>
+      <w:r>
+        <w:rPr>
+          <w:i/>
+          <w:iCs/>
+          <w:color w:val="555555"/>
+          <w:sz w:val="18"/>
+          <w:szCs w:val="18"/>
+        </w:rPr>
+        <w:t xml:space="preserve">Figura 4. Pronóstico de Monterrey: clima actual, por horas y a 7 días.</w:t>
+      </w:r>
+    </w:p>
+    <w:p>
+      <w:pPr>
+        <w:spacing w:after="60" w:before="200"/>
+        <w:jc w:val="center"/>
+      </w:pPr>
+      <w:r>
+        <w:drawing>
+          <wp:inline distT="0" distB="0" distL="0" distR="0">
+            <wp:extent cx="5715000" cy="3048000"/>
+            <wp:effectExtent t="0" r="0" b="0" l="0"/>
+            <wp:docPr id="1" name="" descr="" title=""/>
+            <wp:cNvGraphicFramePr>
+              <a:graphicFrameLocks xmlns:a="http://schemas.openxmlformats.org/drawingml/2006/main" noChangeAspect="1"/>
+            </wp:cNvGraphicFramePr>
+            <a:graphic xmlns:a="http://schemas.openxmlformats.org/drawingml/2006/main">
+              <a:graphicData uri="http://schemas.openxmlformats.org/drawingml/2006/picture">
+                <pic:pic xmlns:pic="http://schemas.openxmlformats.org/drawingml/2006/picture">
+                  <pic:nvPicPr>
+                    <pic:cNvPr id="0" name="" descr=""/>
+                    <pic:cNvPicPr>
+                      <a:picLocks noChangeAspect="1" noChangeArrowheads="1"/>
+                    </pic:cNvPicPr>
+                  </pic:nvPicPr>
+                  <pic:blipFill>
+                    <a:blip r:embed="rId12" cstate="none"/>
+                    <a:srcRect/>
+                    <a:stretch>
+                      <a:fillRect/>
+                    </a:stretch>
+                  </pic:blipFill>
+                  <pic:spPr bwMode="auto">
+                    <a:xfrm>
+                      <a:off x="0" y="0"/>
+                      <a:ext cx="5715000" cy="3048000"/>
+                    </a:xfrm>
+                    <a:prstGeom prst="rect">
+                      <a:avLst/>
+                    </a:prstGeom>
+                  </pic:spPr>
+                </pic:pic>
+              </a:graphicData>
+            </a:graphic>
+          </wp:inline>
+        </w:drawing>
+      </w:r>
+    </w:p>
+    <w:p>
+      <w:pPr>
+        <w:spacing w:after="200"/>
+        <w:jc w:val="center"/>
+      </w:pPr>
+      <w:r>
+        <w:rPr>
+          <w:i/>
+          <w:iCs/>
+          <w:color w:val="555555"/>
+          <w:sz w:val="18"/>
+          <w:szCs w:val="18"/>
+        </w:rPr>
+        <w:t xml:space="preserve">Figura 5. Lista de ciudades guardadas en Room con su última temperatura conocida.</w:t>
       </w:r>
     </w:p>
     <w:p>

</xml_diff>